<commit_message>
complete of phase 2
</commit_message>
<xml_diff>
--- a/docs/SAD.docx
+++ b/docs/SAD.docx
@@ -338,7 +338,7 @@
               <w:rPr>
                 <w:sz w:val="20"/>
               </w:rPr>
-              <w:t>Kamal Kanth N</w:t>
+              <w:t>Vinay M Rampur</w:t>
             </w:r>
           </w:p>
         </w:tc>
@@ -351,7 +351,7 @@
               <w:rPr>
                 <w:sz w:val="20"/>
               </w:rPr>
-              <w:t>PES1UG24AM434</w:t>
+              <w:t>PES1UG24AM455</w:t>
             </w:r>
           </w:p>
         </w:tc>
@@ -379,7 +379,7 @@
               <w:rPr>
                 <w:sz w:val="20"/>
               </w:rPr>
-              <w:t>Vinay M Rampur</w:t>
+              <w:t>Kamal Kanth N</w:t>
             </w:r>
           </w:p>
         </w:tc>
@@ -392,7 +392,7 @@
               <w:rPr>
                 <w:sz w:val="20"/>
               </w:rPr>
-              <w:t>PES1UG24AM455</w:t>
+              <w:t>PES1UG24AM434</w:t>
             </w:r>
           </w:p>
         </w:tc>
@@ -622,7 +622,7 @@
               <w:rPr>
                 <w:sz w:val="20"/>
               </w:rPr>
-              <w:t>Kamal Kanth N</w:t>
+              <w:t>Vinay M Rampur</w:t>
             </w:r>
           </w:p>
         </w:tc>
@@ -676,7 +676,7 @@
               <w:rPr>
                 <w:sz w:val="20"/>
               </w:rPr>
-              <w:t>Vinay M Rampur</w:t>
+              <w:t>Kamal Kanth N</w:t>
             </w:r>
           </w:p>
         </w:tc>
@@ -2031,8 +2031,42 @@
       </w:r>
     </w:p>
     <w:p>
+      <w:pPr>
+        <w:jc w:val="center"/>
+      </w:pPr>
       <w:r>
-        <w:t>&lt;&lt; Insert UML Component Diagram here &gt;&gt;</w:t>
+        <w:drawing>
+          <wp:inline xmlns:a="http://schemas.openxmlformats.org/drawingml/2006/main" xmlns:pic="http://schemas.openxmlformats.org/drawingml/2006/picture">
+            <wp:extent cx="5486400" cy="5486400"/>
+            <wp:docPr id="1" name="Picture 1"/>
+            <wp:cNvGraphicFramePr>
+              <a:graphicFrameLocks noChangeAspect="1"/>
+            </wp:cNvGraphicFramePr>
+            <a:graphic>
+              <a:graphicData uri="http://schemas.openxmlformats.org/drawingml/2006/picture">
+                <pic:pic>
+                  <pic:nvPicPr>
+                    <pic:cNvPr id="0" name="componentdiagram.png"/>
+                    <pic:cNvPicPr/>
+                  </pic:nvPicPr>
+                  <pic:blipFill>
+                    <a:blip r:embed="rId9"/>
+                    <a:stretch>
+                      <a:fillRect/>
+                    </a:stretch>
+                  </pic:blipFill>
+                  <pic:spPr>
+                    <a:xfrm>
+                      <a:off x="0" y="0"/>
+                      <a:ext cx="5486400" cy="5486400"/>
+                    </a:xfrm>
+                    <a:prstGeom prst="rect"/>
+                  </pic:spPr>
+                </pic:pic>
+              </a:graphicData>
+            </a:graphic>
+          </wp:inline>
+        </w:drawing>
       </w:r>
     </w:p>
     <w:p>
@@ -5237,13 +5271,42 @@
       </w:r>
     </w:p>
     <w:p>
+      <w:pPr>
+        <w:jc w:val="center"/>
+      </w:pPr>
       <w:r>
-        <w:t>&lt;&lt; Insert UML Sequence Diagram 1 here &gt;&gt;</w:t>
-      </w:r>
-    </w:p>
-    <w:p>
-      <w:r>
-        <w:t>Flow: User → Frontend → POST /upload → Backend validates file → Transcription Module (stub) → Text Preprocessor → Extractor Module → Document Generator → Save to DB → Return minutes to Frontend → Display to User</w:t>
+        <w:drawing>
+          <wp:inline xmlns:a="http://schemas.openxmlformats.org/drawingml/2006/main" xmlns:pic="http://schemas.openxmlformats.org/drawingml/2006/picture">
+            <wp:extent cx="5486400" cy="3108740"/>
+            <wp:docPr id="2" name="Picture 2"/>
+            <wp:cNvGraphicFramePr>
+              <a:graphicFrameLocks noChangeAspect="1"/>
+            </wp:cNvGraphicFramePr>
+            <a:graphic>
+              <a:graphicData uri="http://schemas.openxmlformats.org/drawingml/2006/picture">
+                <pic:pic>
+                  <pic:nvPicPr>
+                    <pic:cNvPr id="0" name="sequence_upload_process.png"/>
+                    <pic:cNvPicPr/>
+                  </pic:nvPicPr>
+                  <pic:blipFill>
+                    <a:blip r:embed="rId10"/>
+                    <a:stretch>
+                      <a:fillRect/>
+                    </a:stretch>
+                  </pic:blipFill>
+                  <pic:spPr>
+                    <a:xfrm>
+                      <a:off x="0" y="0"/>
+                      <a:ext cx="5486400" cy="3108740"/>
+                    </a:xfrm>
+                    <a:prstGeom prst="rect"/>
+                  </pic:spPr>
+                </pic:pic>
+              </a:graphicData>
+            </a:graphic>
+          </wp:inline>
+        </w:drawing>
       </w:r>
     </w:p>
     <w:p>
@@ -5255,13 +5318,42 @@
       </w:r>
     </w:p>
     <w:p>
+      <w:pPr>
+        <w:jc w:val="center"/>
+      </w:pPr>
       <w:r>
-        <w:t>&lt;&lt; Insert UML Sequence Diagram 2 here &gt;&gt;</w:t>
-      </w:r>
-    </w:p>
-    <w:p>
-      <w:r>
-        <w:t>Flow: User → Frontend → GET /history → Backend queries DB → Return meeting list → User selects meeting → GET /minutes/:id → Display minutes → User clicks Export → GET /minutes/:id/pdf → Generate PDF → Download</w:t>
+        <w:drawing>
+          <wp:inline xmlns:a="http://schemas.openxmlformats.org/drawingml/2006/main" xmlns:pic="http://schemas.openxmlformats.org/drawingml/2006/picture">
+            <wp:extent cx="5486400" cy="3657600"/>
+            <wp:docPr id="3" name="Picture 3"/>
+            <wp:cNvGraphicFramePr>
+              <a:graphicFrameLocks noChangeAspect="1"/>
+            </wp:cNvGraphicFramePr>
+            <a:graphic>
+              <a:graphicData uri="http://schemas.openxmlformats.org/drawingml/2006/picture">
+                <pic:pic>
+                  <pic:nvPicPr>
+                    <pic:cNvPr id="0" name="sequence_history_export.png"/>
+                    <pic:cNvPicPr/>
+                  </pic:nvPicPr>
+                  <pic:blipFill>
+                    <a:blip r:embed="rId11"/>
+                    <a:stretch>
+                      <a:fillRect/>
+                    </a:stretch>
+                  </pic:blipFill>
+                  <pic:spPr>
+                    <a:xfrm>
+                      <a:off x="0" y="0"/>
+                      <a:ext cx="5486400" cy="3657600"/>
+                    </a:xfrm>
+                    <a:prstGeom prst="rect"/>
+                  </pic:spPr>
+                </pic:pic>
+              </a:graphicData>
+            </a:graphic>
+          </wp:inline>
+        </w:drawing>
       </w:r>
     </w:p>
     <w:p>
@@ -6996,37 +7088,144 @@
       </w:r>
     </w:p>
     <w:p>
+      <w:pPr>
+        <w:pStyle w:val="Heading3"/>
+      </w:pPr>
       <w:r>
-        <w:t>&lt;&lt; Insert UI wireframes/mockups here &gt;&gt;</w:t>
-      </w:r>
-    </w:p>
-    <w:p>
-      <w:r>
-        <w:t>Pages to design:</w:t>
+        <w:t>Home Page (Audio Upload)</w:t>
       </w:r>
     </w:p>
     <w:p>
       <w:pPr>
-        <w:pStyle w:val="ListBullet"/>
+        <w:jc w:val="center"/>
       </w:pPr>
       <w:r>
-        <w:t>Home Page — Audio upload form with drag-and-drop, meeting metadata fields</w:t>
+        <w:drawing>
+          <wp:inline xmlns:a="http://schemas.openxmlformats.org/drawingml/2006/main" xmlns:pic="http://schemas.openxmlformats.org/drawingml/2006/picture">
+            <wp:extent cx="5486400" cy="3643763"/>
+            <wp:docPr id="4" name="Picture 4"/>
+            <wp:cNvGraphicFramePr>
+              <a:graphicFrameLocks noChangeAspect="1"/>
+            </wp:cNvGraphicFramePr>
+            <a:graphic>
+              <a:graphicData uri="http://schemas.openxmlformats.org/drawingml/2006/picture">
+                <pic:pic>
+                  <pic:nvPicPr>
+                    <pic:cNvPr id="0" name="wireframe_home.png"/>
+                    <pic:cNvPicPr/>
+                  </pic:nvPicPr>
+                  <pic:blipFill>
+                    <a:blip r:embed="rId12"/>
+                    <a:stretch>
+                      <a:fillRect/>
+                    </a:stretch>
+                  </pic:blipFill>
+                  <pic:spPr>
+                    <a:xfrm>
+                      <a:off x="0" y="0"/>
+                      <a:ext cx="5486400" cy="3643763"/>
+                    </a:xfrm>
+                    <a:prstGeom prst="rect"/>
+                  </pic:spPr>
+                </pic:pic>
+              </a:graphicData>
+            </a:graphic>
+          </wp:inline>
+        </w:drawing>
       </w:r>
     </w:p>
     <w:p>
       <w:pPr>
-        <w:pStyle w:val="ListBullet"/>
+        <w:pStyle w:val="Heading3"/>
       </w:pPr>
       <w:r>
-        <w:t>Minutes Viewer — Structured display of minutes with editable action items table, Export PDF button</w:t>
+        <w:t>Minutes Viewer (Minutes Display &amp; Action Items Editor)</w:t>
       </w:r>
     </w:p>
     <w:p>
       <w:pPr>
-        <w:pStyle w:val="ListBullet"/>
+        <w:jc w:val="center"/>
       </w:pPr>
       <w:r>
-        <w:t>History Page — Searchable paginated list of past meetings</w:t>
+        <w:drawing>
+          <wp:inline xmlns:a="http://schemas.openxmlformats.org/drawingml/2006/main" xmlns:pic="http://schemas.openxmlformats.org/drawingml/2006/picture">
+            <wp:extent cx="5486400" cy="3869681"/>
+            <wp:docPr id="5" name="Picture 5"/>
+            <wp:cNvGraphicFramePr>
+              <a:graphicFrameLocks noChangeAspect="1"/>
+            </wp:cNvGraphicFramePr>
+            <a:graphic>
+              <a:graphicData uri="http://schemas.openxmlformats.org/drawingml/2006/picture">
+                <pic:pic>
+                  <pic:nvPicPr>
+                    <pic:cNvPr id="0" name="wireframe_minutes_viewer.png"/>
+                    <pic:cNvPicPr/>
+                  </pic:nvPicPr>
+                  <pic:blipFill>
+                    <a:blip r:embed="rId13"/>
+                    <a:stretch>
+                      <a:fillRect/>
+                    </a:stretch>
+                  </pic:blipFill>
+                  <pic:spPr>
+                    <a:xfrm>
+                      <a:off x="0" y="0"/>
+                      <a:ext cx="5486400" cy="3869681"/>
+                    </a:xfrm>
+                    <a:prstGeom prst="rect"/>
+                  </pic:spPr>
+                </pic:pic>
+              </a:graphicData>
+            </a:graphic>
+          </wp:inline>
+        </w:drawing>
+      </w:r>
+    </w:p>
+    <w:p>
+      <w:pPr>
+        <w:pStyle w:val="Heading3"/>
+      </w:pPr>
+      <w:r>
+        <w:t>History Page (Searchable Archive)</w:t>
+      </w:r>
+    </w:p>
+    <w:p>
+      <w:pPr>
+        <w:jc w:val="center"/>
+      </w:pPr>
+      <w:r>
+        <w:drawing>
+          <wp:inline xmlns:a="http://schemas.openxmlformats.org/drawingml/2006/main" xmlns:pic="http://schemas.openxmlformats.org/drawingml/2006/picture">
+            <wp:extent cx="5486400" cy="3643763"/>
+            <wp:docPr id="6" name="Picture 6"/>
+            <wp:cNvGraphicFramePr>
+              <a:graphicFrameLocks noChangeAspect="1"/>
+            </wp:cNvGraphicFramePr>
+            <a:graphic>
+              <a:graphicData uri="http://schemas.openxmlformats.org/drawingml/2006/picture">
+                <pic:pic>
+                  <pic:nvPicPr>
+                    <pic:cNvPr id="0" name="wireframe_history.png"/>
+                    <pic:cNvPicPr/>
+                  </pic:nvPicPr>
+                  <pic:blipFill>
+                    <a:blip r:embed="rId14"/>
+                    <a:stretch>
+                      <a:fillRect/>
+                    </a:stretch>
+                  </pic:blipFill>
+                  <pic:spPr>
+                    <a:xfrm>
+                      <a:off x="0" y="0"/>
+                      <a:ext cx="5486400" cy="3643763"/>
+                    </a:xfrm>
+                    <a:prstGeom prst="rect"/>
+                  </pic:spPr>
+                </pic:pic>
+              </a:graphicData>
+            </a:graphic>
+          </wp:inline>
+        </w:drawing>
       </w:r>
     </w:p>
     <w:p>
@@ -7038,8 +7237,42 @@
       </w:r>
     </w:p>
     <w:p>
+      <w:pPr>
+        <w:jc w:val="center"/>
+      </w:pPr>
       <w:r>
-        <w:t>&lt;&lt; Insert ER Diagram here &gt;&gt;</w:t>
+        <w:drawing>
+          <wp:inline xmlns:a="http://schemas.openxmlformats.org/drawingml/2006/main" xmlns:pic="http://schemas.openxmlformats.org/drawingml/2006/picture">
+            <wp:extent cx="5486400" cy="4591584"/>
+            <wp:docPr id="7" name="Picture 7"/>
+            <wp:cNvGraphicFramePr>
+              <a:graphicFrameLocks noChangeAspect="1"/>
+            </wp:cNvGraphicFramePr>
+            <a:graphic>
+              <a:graphicData uri="http://schemas.openxmlformats.org/drawingml/2006/picture">
+                <pic:pic>
+                  <pic:nvPicPr>
+                    <pic:cNvPr id="0" name="erdiagram.png"/>
+                    <pic:cNvPicPr/>
+                  </pic:nvPicPr>
+                  <pic:blipFill>
+                    <a:blip r:embed="rId15"/>
+                    <a:stretch>
+                      <a:fillRect/>
+                    </a:stretch>
+                  </pic:blipFill>
+                  <pic:spPr>
+                    <a:xfrm>
+                      <a:off x="0" y="0"/>
+                      <a:ext cx="5486400" cy="4591584"/>
+                    </a:xfrm>
+                    <a:prstGeom prst="rect"/>
+                  </pic:spPr>
+                </pic:pic>
+              </a:graphicData>
+            </a:graphic>
+          </wp:inline>
+        </w:drawing>
       </w:r>
     </w:p>
     <w:p>
@@ -8603,7 +8836,7 @@
               <w:rPr>
                 <w:sz w:val="20"/>
               </w:rPr>
-              <w:t>Vinay M Rampur</w:t>
+              <w:t>Kamal Kanth N</w:t>
             </w:r>
           </w:p>
         </w:tc>
@@ -8711,7 +8944,7 @@
               <w:rPr>
                 <w:sz w:val="20"/>
               </w:rPr>
-              <w:t>Kamal Kanth N</w:t>
+              <w:t>Vinay M Rampur</w:t>
             </w:r>
           </w:p>
         </w:tc>

</xml_diff>